<commit_message>
question 3 of assignment 5
</commit_message>
<xml_diff>
--- a/Assignment5/CMSC4200_Assignment5.docx
+++ b/Assignment5/CMSC4200_Assignment5.docx
@@ -2143,54 +2143,17 @@
     <w:p>
       <w:pPr>
         <w:pStyle w:val="ListParagraph"/>
-        <w:numPr>
-          <w:ilvl w:val="0"/>
-          <w:numId w:val="12"/>
-        </w:numPr>
-      </w:pPr>
-      <w:r>
-        <w:rPr>
-          <w:i/>
-          <w:iCs/>
-        </w:rPr>
-        <w:t>Q</w:t>
-      </w:r>
-      <w:r>
-        <w:t>(</w:t>
-      </w:r>
-      <w:r>
-        <w:rPr>
-          <w:i/>
-          <w:iCs/>
-        </w:rPr>
-        <w:t>x</w:t>
-      </w:r>
-      <w:r>
-        <w:t xml:space="preserve">, </w:t>
-      </w:r>
-      <w:r>
-        <w:rPr>
-          <w:i/>
-          <w:iCs/>
-        </w:rPr>
-        <w:t>y</w:t>
-      </w:r>
-      <w:r>
-        <w:t xml:space="preserve">, M),  Q(N, M, </w:t>
-      </w:r>
-      <w:r>
-        <w:rPr>
-          <w:i/>
-          <w:iCs/>
-        </w:rPr>
-        <w:t>x</w:t>
-      </w:r>
-      <w:r>
-        <w:t>).</w:t>
-      </w:r>
-      <w:r>
-        <w:t xml:space="preserve">  </w:t>
-      </w:r>
+        <w:ind w:left="1080"/>
+      </w:pPr>
+      <w:r>
+        <w:t>{x -&gt; N, y -&gt; M, z -&gt; N}</w:t>
+      </w:r>
+    </w:p>
+    <w:p>
+      <w:pPr>
+        <w:pStyle w:val="ListParagraph"/>
+        <w:ind w:left="1080"/>
+      </w:pPr>
     </w:p>
     <w:p>
       <w:pPr>
@@ -2205,6 +2168,85 @@
           <w:i/>
           <w:iCs/>
         </w:rPr>
+        <w:t>Q</w:t>
+      </w:r>
+      <w:r>
+        <w:t>(</w:t>
+      </w:r>
+      <w:r>
+        <w:rPr>
+          <w:i/>
+          <w:iCs/>
+        </w:rPr>
+        <w:t>x</w:t>
+      </w:r>
+      <w:r>
+        <w:t xml:space="preserve">, </w:t>
+      </w:r>
+      <w:r>
+        <w:rPr>
+          <w:i/>
+          <w:iCs/>
+        </w:rPr>
+        <w:t>y</w:t>
+      </w:r>
+      <w:r>
+        <w:t xml:space="preserve">, M),  Q(N, M, </w:t>
+      </w:r>
+      <w:r>
+        <w:rPr>
+          <w:i/>
+          <w:iCs/>
+        </w:rPr>
+        <w:t>x</w:t>
+      </w:r>
+      <w:r>
+        <w:t>).</w:t>
+      </w:r>
+      <w:r>
+        <w:t xml:space="preserve">  </w:t>
+      </w:r>
+    </w:p>
+    <w:p>
+      <w:pPr>
+        <w:pStyle w:val="ListParagraph"/>
+        <w:ind w:left="1080"/>
+      </w:pPr>
+      <w:r>
+        <w:t>Does not exist, since x must be the same in both sentences, but x is forced to be an N in one sentence, and an M in the other sentence.</w:t>
+      </w:r>
+      <w:r>
+        <w:t xml:space="preserve"> Since</w:t>
+      </w:r>
+      <w:r>
+        <w:t xml:space="preserve"> x cannot be two things at the same time</w:t>
+      </w:r>
+      <w:r>
+        <w:t>, we cannot make the sentences equivalent</w:t>
+      </w:r>
+      <w:r>
+        <w:t>.</w:t>
+      </w:r>
+    </w:p>
+    <w:p>
+      <w:pPr>
+        <w:pStyle w:val="ListParagraph"/>
+        <w:ind w:left="1080"/>
+      </w:pPr>
+    </w:p>
+    <w:p>
+      <w:pPr>
+        <w:pStyle w:val="ListParagraph"/>
+        <w:numPr>
+          <w:ilvl w:val="0"/>
+          <w:numId w:val="12"/>
+        </w:numPr>
+      </w:pPr>
+      <w:r>
+        <w:rPr>
+          <w:i/>
+          <w:iCs/>
+        </w:rPr>
         <w:t>Knows(y, y), Knows(Father(x), x</w:t>
       </w:r>
       <w:r>
@@ -2212,6 +2254,30 @@
       </w:r>
       <w:r>
         <w:t xml:space="preserve"> </w:t>
+      </w:r>
+    </w:p>
+    <w:p>
+      <w:pPr>
+        <w:pStyle w:val="ListParagraph"/>
+        <w:ind w:left="1080"/>
+      </w:pPr>
+      <w:r>
+        <w:t>Does not exist, since Knows(y, y) requires both y’s to be the same</w:t>
+      </w:r>
+      <w:r>
+        <w:t xml:space="preserve">. </w:t>
+      </w:r>
+      <w:r>
+        <w:t>To make Knows(y, y) = Knows(Father(x), x), that means Father(x) must equal x. This does not have a valid solution</w:t>
+      </w:r>
+      <w:r>
+        <w:t xml:space="preserve"> because Father(x) cannot equal x</w:t>
+      </w:r>
+      <w:r>
+        <w:t>, s</w:t>
+      </w:r>
+      <w:r>
+        <w:t>o we cannot make the sentences equivalent.</w:t>
       </w:r>
     </w:p>
     <w:p>
@@ -2226,58 +2292,40 @@
     <w:p>
       <w:pPr>
         <w:jc w:val="both"/>
+      </w:pPr>
+      <w:r>
         <w:rPr>
           <w:b/>
           <w:bCs/>
         </w:rPr>
-      </w:pPr>
-    </w:p>
-    <w:p>
-      <w:pPr>
-        <w:jc w:val="both"/>
+        <w:t>Q</w:t>
+      </w:r>
+      <w:r>
         <w:rPr>
           <w:b/>
           <w:bCs/>
         </w:rPr>
-      </w:pPr>
-    </w:p>
-    <w:p>
-      <w:pPr>
-        <w:jc w:val="both"/>
-      </w:pPr>
+        <w:t>uestion 4</w:t>
+      </w:r>
       <w:r>
         <w:rPr>
           <w:b/>
           <w:bCs/>
         </w:rPr>
-        <w:t>Q</w:t>
+        <w:t>. (</w:t>
       </w:r>
       <w:r>
         <w:rPr>
           <w:b/>
           <w:bCs/>
         </w:rPr>
-        <w:t>uestion 4</w:t>
+        <w:t>5</w:t>
       </w:r>
       <w:r>
         <w:rPr>
           <w:b/>
           <w:bCs/>
         </w:rPr>
-        <w:t>. (</w:t>
-      </w:r>
-      <w:r>
-        <w:rPr>
-          <w:b/>
-          <w:bCs/>
-        </w:rPr>
-        <w:t>5</w:t>
-      </w:r>
-      <w:r>
-        <w:rPr>
-          <w:b/>
-          <w:bCs/>
-        </w:rPr>
         <w:t xml:space="preserve"> points)</w:t>
       </w:r>
       <w:r>
@@ -2355,15 +2403,7 @@
           <w:i/>
           <w:iCs/>
         </w:rPr>
-        <w:t>C(</w:t>
-      </w:r>
-      <w:proofErr w:type="gramStart"/>
-      <w:r>
-        <w:rPr>
-          <w:i/>
-          <w:iCs/>
-        </w:rPr>
-        <w:t>y)</w:t>
+        <w:t>C(y)</w:t>
       </w:r>
       <w:r>
         <w:t>,</w:t>
@@ -2413,18 +2453,8 @@
           <w:i/>
           <w:iCs/>
         </w:rPr>
-        <w:t>D(z</w:t>
-      </w:r>
-      <w:proofErr w:type="gramEnd"/>
-      <w:r>
-        <w:rPr>
-          <w:rFonts w:ascii="Cambria Math" w:hAnsi="Cambria Math" w:cs="Cambria Math"/>
-          <w:i/>
-          <w:iCs/>
-        </w:rPr>
-        <w:t>)</w:t>
-      </w:r>
-      <w:proofErr w:type="gramStart"/>
+        <w:t>D(z)</w:t>
+      </w:r>
       <w:r>
         <w:rPr>
           <w:rFonts w:ascii="Cambria Math" w:hAnsi="Cambria Math" w:cs="Cambria Math"/>
@@ -2478,7 +2508,6 @@
         </w:rPr>
         <w:t>)}</w:t>
       </w:r>
-      <w:proofErr w:type="gramEnd"/>
       <w:r>
         <w:t xml:space="preserve">  </w:t>
       </w:r>
@@ -3113,6 +3142,7 @@
           <w:i/>
           <w:iCs/>
         </w:rPr>
+        <w:lastRenderedPageBreak/>
         <w:t>11.</w:t>
       </w:r>
       <w:r>
@@ -3229,7 +3259,6 @@
           <w:i/>
           <w:iCs/>
         </w:rPr>
-        <w:lastRenderedPageBreak/>
         <w:t>Use Resolution for 12. Using 7. And 11.</w:t>
       </w:r>
     </w:p>

</xml_diff>